<commit_message>
docs: ghi chú màn hình OEE/Dừng máy chưa được lập trình
Nút điều hướng đã có nhưng VIEWS.oee chưa tồn tại trong app.js — cập
nhật hướng dẫn sử dụng để phản ánh đúng: chỉ backend (model/service)
đã sẵn sàng, chưa có giao diện thao tác.
</commit_message>
<xml_diff>
--- a/docs/03-HUONG-DAN-SU-DUNG.docx
+++ b/docs/03-HUONG-DAN-SU-DUNG.docx
@@ -17781,305 +17781,466 @@
       </w:r>
     </w:p>
     <w:p>
-      <w:r>
-        <w:rPr>
-          <w:b/>
-          <w:sz w:val="21"/>
-        </w:rPr>
-        <w:t>Mục đích:</w:t>
-      </w:r>
-      <w:r>
-        <w:rPr>
-          <w:sz w:val="21"/>
-        </w:rPr>
-        <w:t xml:space="preserve"> đo hiệu suất thiết bị tổng thể (Overall Equipment Effectiveness) và phân tích lý do dừng máy theo dây chuyền — 1 màn hình duy nhất, không chia sub-tab, gồm 6 khối:</w:t>
-      </w:r>
-    </w:p>
-    <w:p>
       <w:pPr>
-        <w:pStyle w:val="ListNumber"/>
+        <w:ind w:left="432"/>
       </w:pPr>
       <w:r>
         <w:rPr>
           <w:b/>
-          <w:sz w:val="21"/>
-        </w:rPr>
-        <w:t>⚙️ OEE đóng gói</w:t>
-      </w:r>
-      <w:r>
-        <w:rPr>
-          <w:sz w:val="21"/>
-        </w:rPr>
-        <w:t xml:space="preserve"> — 1 biểu đồ donut/dây chuyền·ca đã ghi, kèm % Availability/Performance/Quality (A/P/Q).</w:t>
+          <w:i/>
+          <w:color w:val="555555"/>
+          <w:sz w:val="19"/>
+        </w:rPr>
+        <w:t>⚠️ Màn hình chưa hoạt động.</w:t>
+      </w:r>
+      <w:r>
+        <w:rPr>
+          <w:i/>
+          <w:color w:val="555555"/>
+          <w:sz w:val="19"/>
+        </w:rPr>
+        <w:t xml:space="preserve"> Tab </w:t>
+      </w:r>
+      <w:r>
+        <w:rPr>
+          <w:b/>
+          <w:i/>
+          <w:color w:val="555555"/>
+          <w:sz w:val="19"/>
+        </w:rPr>
+        <w:t>OEE/Dừng máy</w:t>
+      </w:r>
+      <w:r>
+        <w:rPr>
+          <w:i/>
+          <w:color w:val="555555"/>
+          <w:sz w:val="19"/>
+        </w:rPr>
+        <w:t xml:space="preserve"> đã có nút trên thanh điều hướng (</w:t>
+      </w:r>
+      <w:r>
+        <w:rPr>
+          <w:rFonts w:ascii="Consolas" w:hAnsi="Consolas"/>
+          <w:i/>
+          <w:color w:val="555555"/>
+          <w:sz w:val="19"/>
+        </w:rPr>
+        <w:t>data-view="oee"</w:t>
+      </w:r>
+      <w:r>
+        <w:rPr>
+          <w:i/>
+          <w:color w:val="555555"/>
+          <w:sz w:val="19"/>
+        </w:rPr>
+        <w:t xml:space="preserve">, class </w:t>
+      </w:r>
+      <w:r>
+        <w:rPr>
+          <w:rFonts w:ascii="Consolas" w:hAnsi="Consolas"/>
+          <w:i/>
+          <w:color w:val="555555"/>
+          <w:sz w:val="19"/>
+        </w:rPr>
+        <w:t>nav-unused</w:t>
+      </w:r>
+      <w:r>
+        <w:rPr>
+          <w:i/>
+          <w:color w:val="555555"/>
+          <w:sz w:val="19"/>
+        </w:rPr>
+        <w:t xml:space="preserve">) nhưng </w:t>
+      </w:r>
+      <w:r>
+        <w:rPr>
+          <w:b/>
+          <w:i/>
+          <w:color w:val="555555"/>
+          <w:sz w:val="19"/>
+        </w:rPr>
+        <w:t>chưa được lập trình</w:t>
+      </w:r>
+      <w:r>
+        <w:rPr>
+          <w:i/>
+          <w:color w:val="555555"/>
+          <w:sz w:val="19"/>
+        </w:rPr>
+        <w:t xml:space="preserve"> — bấm vào không hiển thị gì (không có </w:t>
+      </w:r>
+      <w:r>
+        <w:rPr>
+          <w:rFonts w:ascii="Consolas" w:hAnsi="Consolas"/>
+          <w:i/>
+          <w:color w:val="555555"/>
+          <w:sz w:val="19"/>
+        </w:rPr>
+        <w:t>VIEWS.oee</w:t>
+      </w:r>
+      <w:r>
+        <w:rPr>
+          <w:i/>
+          <w:color w:val="555555"/>
+          <w:sz w:val="19"/>
+        </w:rPr>
+        <w:t xml:space="preserve"> trong </w:t>
+      </w:r>
+      <w:r>
+        <w:rPr>
+          <w:rFonts w:ascii="Consolas" w:hAnsi="Consolas"/>
+          <w:i/>
+          <w:color w:val="555555"/>
+          <w:sz w:val="19"/>
+        </w:rPr>
+        <w:t>frontend/app.js</w:t>
+      </w:r>
+      <w:r>
+        <w:rPr>
+          <w:i/>
+          <w:color w:val="555555"/>
+          <w:sz w:val="19"/>
+        </w:rPr>
+        <w:t xml:space="preserve">, section tương ứng trong </w:t>
+      </w:r>
+      <w:r>
+        <w:rPr>
+          <w:rFonts w:ascii="Consolas" w:hAnsi="Consolas"/>
+          <w:i/>
+          <w:color w:val="555555"/>
+          <w:sz w:val="19"/>
+        </w:rPr>
+        <w:t>frontend/index.html</w:t>
+      </w:r>
+      <w:r>
+        <w:rPr>
+          <w:i/>
+          <w:color w:val="555555"/>
+          <w:sz w:val="19"/>
+        </w:rPr>
+        <w:t xml:space="preserve"> đang để trống; lỗi bị nuốt âm thầm, không có thông báo rõ ràng cho người dùng). Phần dưới đây mô tả </w:t>
+      </w:r>
+      <w:r>
+        <w:rPr>
+          <w:b/>
+          <w:i/>
+          <w:color w:val="555555"/>
+          <w:sz w:val="19"/>
+        </w:rPr>
+        <w:t>dữ liệu và tính năng đã có ở backend</w:t>
+      </w:r>
+      <w:r>
+        <w:rPr>
+          <w:i/>
+          <w:color w:val="555555"/>
+          <w:sz w:val="19"/>
+        </w:rPr>
+        <w:t>, không phải các bước thao tác trên UI — vì UI này chưa tồn tại.</w:t>
+      </w:r>
+    </w:p>
+    <w:p>
+      <w:r>
+        <w:rPr>
+          <w:b/>
+          <w:sz w:val="21"/>
+        </w:rPr>
+        <w:t>Backend đã xây (chưa có màn hình sử dụng):</w:t>
       </w:r>
     </w:p>
     <w:p>
       <w:pPr>
-        <w:pStyle w:val="ListNumber"/>
+        <w:pStyle w:val="ListBullet"/>
       </w:pPr>
       <w:r>
         <w:rPr>
           <w:b/>
           <w:sz w:val="21"/>
         </w:rPr>
-        <w:t>📝 Nhập OEE theo ca</w:t>
-      </w:r>
-      <w:r>
-        <w:rPr>
-          <w:sz w:val="21"/>
-        </w:rPr>
-        <w:t xml:space="preserve"> — chọn </w:t>
-      </w:r>
-      <w:r>
-        <w:rPr>
-          <w:b/>
-          <w:sz w:val="21"/>
-        </w:rPr>
-        <w:t>Dây chuyền</w:t>
-      </w:r>
-      <w:r>
-        <w:rPr>
-          <w:sz w:val="21"/>
-        </w:rPr>
-        <w:t xml:space="preserve"> (tốc độ lý tưởng tự điền theo dây chuyền đã khai báo ở Danh mục) + </w:t>
-      </w:r>
-      <w:r>
-        <w:rPr>
-          <w:b/>
-          <w:sz w:val="21"/>
-        </w:rPr>
-        <w:t>Ca</w:t>
-      </w:r>
-      <w:r>
-        <w:rPr>
-          <w:sz w:val="21"/>
-        </w:rPr>
-        <w:t xml:space="preserve">, nhập </w:t>
-      </w:r>
-      <w:r>
-        <w:rPr>
-          <w:b/>
-          <w:sz w:val="21"/>
-        </w:rPr>
-        <w:t>TG kế hoạch (phút)</w:t>
-      </w:r>
-      <w:r>
-        <w:rPr>
-          <w:sz w:val="21"/>
-        </w:rPr>
-        <w:t xml:space="preserve">, </w:t>
-      </w:r>
-      <w:r>
-        <w:rPr>
-          <w:b/>
-          <w:sz w:val="21"/>
-        </w:rPr>
-        <w:t>Dừng (phút)</w:t>
-      </w:r>
-      <w:r>
-        <w:rPr>
-          <w:sz w:val="21"/>
-        </w:rPr>
-        <w:t xml:space="preserve">, </w:t>
-      </w:r>
-      <w:r>
-        <w:rPr>
-          <w:b/>
-          <w:sz w:val="21"/>
-        </w:rPr>
-        <w:t>Tốc độ lý tưởng</w:t>
-      </w:r>
-      <w:r>
-        <w:rPr>
-          <w:sz w:val="21"/>
-        </w:rPr>
-        <w:t xml:space="preserve">, </w:t>
-      </w:r>
-      <w:r>
-        <w:rPr>
-          <w:b/>
-          <w:sz w:val="21"/>
-        </w:rPr>
-        <w:t>Tổng SP</w:t>
-      </w:r>
-      <w:r>
-        <w:rPr>
-          <w:sz w:val="21"/>
-        </w:rPr>
-        <w:t xml:space="preserve">, </w:t>
-      </w:r>
-      <w:r>
-        <w:rPr>
-          <w:b/>
-          <w:sz w:val="21"/>
-        </w:rPr>
-        <w:t>SP đạt</w:t>
-      </w:r>
-      <w:r>
-        <w:rPr>
-          <w:sz w:val="21"/>
-        </w:rPr>
-        <w:t xml:space="preserve">, bấm </w:t>
-      </w:r>
-      <w:r>
-        <w:rPr>
-          <w:b/>
-          <w:sz w:val="21"/>
-        </w:rPr>
-        <w:t>Ghi OEE</w:t>
-      </w:r>
-      <w:r>
-        <w:rPr>
-          <w:sz w:val="21"/>
-        </w:rPr>
-        <w:t>.</w:t>
+        <w:t>Model:</w:t>
+      </w:r>
+      <w:r>
+        <w:rPr>
+          <w:sz w:val="21"/>
+        </w:rPr>
+        <w:t xml:space="preserve"> </w:t>
+      </w:r>
+      <w:r>
+        <w:rPr>
+          <w:rFonts w:ascii="Consolas" w:hAnsi="Consolas"/>
+          <w:color w:val="555555"/>
+          <w:sz w:val="21"/>
+        </w:rPr>
+        <w:t>OEERecord</w:t>
+      </w:r>
+      <w:r>
+        <w:rPr>
+          <w:sz w:val="21"/>
+        </w:rPr>
+        <w:t xml:space="preserve"> (bản ghi OEE theo dây chuyền/ca — availability/performance/quality) và </w:t>
+      </w:r>
+      <w:r>
+        <w:rPr>
+          <w:rFonts w:ascii="Consolas" w:hAnsi="Consolas"/>
+          <w:color w:val="555555"/>
+          <w:sz w:val="21"/>
+        </w:rPr>
+        <w:t>DowntimeEvent</w:t>
+      </w:r>
+      <w:r>
+        <w:rPr>
+          <w:sz w:val="21"/>
+        </w:rPr>
+        <w:t xml:space="preserve"> (sự kiện dừng máy theo lý do).</w:t>
       </w:r>
     </w:p>
     <w:p>
       <w:pPr>
-        <w:pStyle w:val="ListNumber"/>
+        <w:pStyle w:val="ListBullet"/>
       </w:pPr>
       <w:r>
         <w:rPr>
           <w:b/>
           <w:sz w:val="21"/>
         </w:rPr>
-        <w:t>⏱️ Ghi sự kiện dừng máy (reason-tree)</w:t>
-      </w:r>
-      <w:r>
-        <w:rPr>
-          <w:sz w:val="21"/>
-        </w:rPr>
-        <w:t xml:space="preserve"> — tách riêng khỏi khối OEE trên: chọn Line + </w:t>
-      </w:r>
-      <w:r>
-        <w:rPr>
-          <w:b/>
-          <w:sz w:val="21"/>
-        </w:rPr>
-        <w:t>Nhóm lý do</w:t>
-      </w:r>
-      <w:r>
-        <w:rPr>
-          <w:sz w:val="21"/>
-        </w:rPr>
-        <w:t xml:space="preserve"> (đổi Nhóm sẽ đổi luôn danh sách </w:t>
-      </w:r>
-      <w:r>
-        <w:rPr>
-          <w:b/>
-          <w:sz w:val="21"/>
-        </w:rPr>
-        <w:t>Lý do</w:t>
-      </w:r>
-      <w:r>
-        <w:rPr>
-          <w:sz w:val="21"/>
-        </w:rPr>
-        <w:t xml:space="preserve"> con tương ứng) + số </w:t>
-      </w:r>
-      <w:r>
-        <w:rPr>
-          <w:b/>
-          <w:sz w:val="21"/>
-        </w:rPr>
-        <w:t>Phút</w:t>
-      </w:r>
-      <w:r>
-        <w:rPr>
-          <w:sz w:val="21"/>
-        </w:rPr>
-        <w:t xml:space="preserve"> + Ca, bấm </w:t>
-      </w:r>
-      <w:r>
-        <w:rPr>
-          <w:b/>
-          <w:sz w:val="21"/>
-        </w:rPr>
-        <w:t>Ghi</w:t>
-      </w:r>
-      <w:r>
-        <w:rPr>
-          <w:sz w:val="21"/>
-        </w:rPr>
-        <w:t>.</w:t>
+        <w:t>Tính OEE:</w:t>
+      </w:r>
+      <w:r>
+        <w:rPr>
+          <w:sz w:val="21"/>
+        </w:rPr>
+        <w:t xml:space="preserve"> service </w:t>
+      </w:r>
+      <w:r>
+        <w:rPr>
+          <w:rFonts w:ascii="Consolas" w:hAnsi="Consolas"/>
+          <w:color w:val="555555"/>
+          <w:sz w:val="21"/>
+        </w:rPr>
+        <w:t>compute_oee</w:t>
+      </w:r>
+      <w:r>
+        <w:rPr>
+          <w:sz w:val="21"/>
+        </w:rPr>
+        <w:t xml:space="preserve"> — tính % Availability/Performance/Quality từ 1 bản ghi OEE.</w:t>
       </w:r>
     </w:p>
     <w:p>
       <w:pPr>
-        <w:pStyle w:val="ListNumber"/>
+        <w:pStyle w:val="ListBullet"/>
       </w:pPr>
       <w:r>
         <w:rPr>
           <w:b/>
           <w:sz w:val="21"/>
         </w:rPr>
-        <w:t>📊 Pareto thời gian dừng theo lý do</w:t>
-      </w:r>
-      <w:r>
-        <w:rPr>
-          <w:sz w:val="21"/>
-        </w:rPr>
-        <w:t xml:space="preserve"> — biểu đồ cột + bảng %/% tích lũy/số lần theo từng lý do dừng đã ghi.</w:t>
+        <w:t>Cây lý do dừng máy (reason-tree):</w:t>
+      </w:r>
+      <w:r>
+        <w:rPr>
+          <w:sz w:val="21"/>
+        </w:rPr>
+        <w:t xml:space="preserve"> hằng số </w:t>
+      </w:r>
+      <w:r>
+        <w:rPr>
+          <w:rFonts w:ascii="Consolas" w:hAnsi="Consolas"/>
+          <w:color w:val="555555"/>
+          <w:sz w:val="21"/>
+        </w:rPr>
+        <w:t>REASON_TREE</w:t>
+      </w:r>
+      <w:r>
+        <w:rPr>
+          <w:sz w:val="21"/>
+        </w:rPr>
+        <w:t xml:space="preserve"> hardcode trong </w:t>
+      </w:r>
+      <w:r>
+        <w:rPr>
+          <w:rFonts w:ascii="Consolas" w:hAnsi="Consolas"/>
+          <w:color w:val="555555"/>
+          <w:sz w:val="21"/>
+        </w:rPr>
+        <w:t>backend/app/services/downtime.py</w:t>
+      </w:r>
+      <w:r>
+        <w:rPr>
+          <w:sz w:val="21"/>
+        </w:rPr>
+        <w:t xml:space="preserve">, dùng </w:t>
+      </w:r>
+      <w:r>
+        <w:rPr>
+          <w:b/>
+          <w:sz w:val="21"/>
+        </w:rPr>
+        <w:t>chung 1 cây cho mọi dây chuyền</w:t>
+      </w:r>
+      <w:r>
+        <w:rPr>
+          <w:sz w:val="21"/>
+        </w:rPr>
+        <w:t xml:space="preserve"> (chưa phân theo loại dây chuyền/thiết bị).</w:t>
       </w:r>
     </w:p>
     <w:p>
       <w:pPr>
-        <w:pStyle w:val="ListNumber"/>
+        <w:pStyle w:val="ListBullet"/>
       </w:pPr>
       <w:r>
         <w:rPr>
           <w:b/>
           <w:sz w:val="21"/>
         </w:rPr>
-        <w:t>🥧 Phân rã 6 big losses</w:t>
-      </w:r>
-      <w:r>
-        <w:rPr>
-          <w:sz w:val="21"/>
-        </w:rPr>
-        <w:t xml:space="preserve"> — 2 biểu đồ tròn cạnh nhau: theo nhóm lý do lớn và theo nhóm chi tiết.</w:t>
+        <w:t>Pareto thời gian dừng</w:t>
+      </w:r>
+      <w:r>
+        <w:rPr>
+          <w:sz w:val="21"/>
+        </w:rPr>
+        <w:t xml:space="preserve"> — service </w:t>
+      </w:r>
+      <w:r>
+        <w:rPr>
+          <w:rFonts w:ascii="Consolas" w:hAnsi="Consolas"/>
+          <w:color w:val="555555"/>
+          <w:sz w:val="21"/>
+        </w:rPr>
+        <w:t>pareto()</w:t>
+      </w:r>
+      <w:r>
+        <w:rPr>
+          <w:sz w:val="21"/>
+        </w:rPr>
+        <w:t>: xếp hạng giảm dần theo phút dừng cho từng lý do, kèm %/% tích lũy/số lần.</w:t>
       </w:r>
     </w:p>
     <w:p>
       <w:pPr>
-        <w:pStyle w:val="ListNumber"/>
+        <w:pStyle w:val="ListBullet"/>
       </w:pPr>
       <w:r>
         <w:rPr>
           <w:b/>
           <w:sz w:val="21"/>
         </w:rPr>
-        <w:t>🔧 MTBF/MTTR theo thiết bị</w:t>
-      </w:r>
-      <w:r>
-        <w:rPr>
-          <w:sz w:val="21"/>
-        </w:rPr>
-        <w:t xml:space="preserve"> — bảng số lần hỏng, MTBF (giờ), MTTR (phút), % khả dụng, phút dừng, tính trong cửa sổ N ngày gần nhất.</w:t>
-      </w:r>
-    </w:p>
-    <w:p>
-      <w:r>
-        <w:rPr>
-          <w:sz w:val="21"/>
-        </w:rPr>
-        <w:t>Thêm/ngừng dây chuyền đóng gói ở Danh mục (mục 21) — chưa có dây chuyền thì không ghi được OEE/dừng máy.</w:t>
-      </w:r>
-    </w:p>
-    <w:p>
-      <w:r>
-        <w:rPr>
-          <w:b/>
-          <w:sz w:val="21"/>
-        </w:rPr>
-        <w:t>Dữ liệu thật hiện tại:</w:t>
-      </w:r>
-      <w:r>
-        <w:rPr>
-          <w:sz w:val="21"/>
-        </w:rPr>
-        <w:t xml:space="preserve"> 3 bản ghi OEE đang có trong hệ thống.</w:t>
+        <w:t>Phân rã big losses</w:t>
+      </w:r>
+      <w:r>
+        <w:rPr>
+          <w:sz w:val="21"/>
+        </w:rPr>
+        <w:t xml:space="preserve"> — service </w:t>
+      </w:r>
+      <w:r>
+        <w:rPr>
+          <w:rFonts w:ascii="Consolas" w:hAnsi="Consolas"/>
+          <w:color w:val="555555"/>
+          <w:sz w:val="21"/>
+        </w:rPr>
+        <w:t>big_losses()</w:t>
+      </w:r>
+      <w:r>
+        <w:rPr>
+          <w:sz w:val="21"/>
+        </w:rPr>
+        <w:t xml:space="preserve">: gộp theo </w:t>
+      </w:r>
+      <w:r>
+        <w:rPr>
+          <w:rFonts w:ascii="Consolas" w:hAnsi="Consolas"/>
+          <w:color w:val="555555"/>
+          <w:sz w:val="21"/>
+        </w:rPr>
+        <w:t>loss_category</w:t>
+      </w:r>
+      <w:r>
+        <w:rPr>
+          <w:sz w:val="21"/>
+        </w:rPr>
+        <w:t xml:space="preserve">, thực tế chỉ có </w:t>
+      </w:r>
+      <w:r>
+        <w:rPr>
+          <w:b/>
+          <w:sz w:val="21"/>
+        </w:rPr>
+        <w:t>3 nhóm</w:t>
+      </w:r>
+      <w:r>
+        <w:rPr>
+          <w:sz w:val="21"/>
+        </w:rPr>
+        <w:t xml:space="preserve"> (availability/performance/quality), không phải "6 big losses" theo đúng nghĩa TPM.</w:t>
+      </w:r>
+    </w:p>
+    <w:p>
+      <w:pPr>
+        <w:pStyle w:val="ListBullet"/>
+      </w:pPr>
+      <w:r>
+        <w:rPr>
+          <w:b/>
+          <w:sz w:val="21"/>
+        </w:rPr>
+        <w:t>MTBF/MTTR</w:t>
+      </w:r>
+      <w:r>
+        <w:rPr>
+          <w:sz w:val="21"/>
+        </w:rPr>
+        <w:t xml:space="preserve"> — service </w:t>
+      </w:r>
+      <w:r>
+        <w:rPr>
+          <w:rFonts w:ascii="Consolas" w:hAnsi="Consolas"/>
+          <w:color w:val="555555"/>
+          <w:sz w:val="21"/>
+        </w:rPr>
+        <w:t>mtbf_mttr()</w:t>
+      </w:r>
+      <w:r>
+        <w:rPr>
+          <w:sz w:val="21"/>
+        </w:rPr>
+        <w:t xml:space="preserve">: số lần hỏng, MTBF (giờ), MTTR (phút), % khả dụng theo thiết bị, tính trong cửa sổ N ngày gần nhất (dựa trên </w:t>
+      </w:r>
+      <w:r>
+        <w:rPr>
+          <w:rFonts w:ascii="Consolas" w:hAnsi="Consolas"/>
+          <w:color w:val="555555"/>
+          <w:sz w:val="21"/>
+        </w:rPr>
+        <w:t>Incident</w:t>
+      </w:r>
+      <w:r>
+        <w:rPr>
+          <w:sz w:val="21"/>
+        </w:rPr>
+        <w:t xml:space="preserve"> + </w:t>
+      </w:r>
+      <w:r>
+        <w:rPr>
+          <w:rFonts w:ascii="Consolas" w:hAnsi="Consolas"/>
+          <w:color w:val="555555"/>
+          <w:sz w:val="21"/>
+        </w:rPr>
+        <w:t>DowntimeEvent</w:t>
+      </w:r>
+      <w:r>
+        <w:rPr>
+          <w:sz w:val="21"/>
+        </w:rPr>
+        <w:t>).</w:t>
+      </w:r>
+    </w:p>
+    <w:p>
+      <w:r>
+        <w:rPr>
+          <w:sz w:val="21"/>
+        </w:rPr>
+        <w:t>Các dữ liệu/logic trên hiện chỉ truy cập được qua API backend hoặc DB trực tiếp — chưa có cách nào nhập OEE theo ca hoặc ghi sự kiện dừng máy từ giao diện người dùng.</w:t>
       </w:r>
     </w:p>
     <w:p>

</xml_diff>